<commit_message>
1. a), b) done
</commit_message>
<xml_diff>
--- a/System of linear equations/SofLU-doc.docx
+++ b/System of linear equations/SofLU-doc.docx
@@ -25,13 +25,7 @@
         <w:rPr>
           <w:rFonts w:cstheme="minorHAnsi"/>
         </w:rPr>
-        <w:t xml:space="preserve">Тема 2. </w:t>
-      </w:r>
-      <w:r>
-        <w:rPr>
-          <w:rFonts w:cstheme="minorHAnsi"/>
-        </w:rPr>
-        <w:t>Решение систем линейных алгебраических уравнений</w:t>
+        <w:t>Тема 2. Решение систем линейных алгебраических уравнений</w:t>
       </w:r>
     </w:p>
     <w:p>
@@ -94,6 +88,258 @@
         </w:rPr>
         <w:t>, перестанавливая строки (обычная, достаточная устойчивость).</w:t>
       </w:r>
+      <w:r>
+        <w:rPr>
+          <w:rFonts w:cstheme="minorHAnsi"/>
+        </w:rPr>
+        <w:t xml:space="preserve"> </w:t>
+      </w:r>
+    </w:p>
+    <w:p>
+      <w:pPr>
+        <w:pStyle w:val="a7"/>
+        <w:ind w:left="360"/>
+        <w:rPr>
+          <w:rFonts w:cstheme="minorHAnsi"/>
+          <w:lang w:val="en-US"/>
+        </w:rPr>
+      </w:pPr>
+      <w:r>
+        <w:rPr>
+          <w:rFonts w:cstheme="minorHAnsi"/>
+          <w:lang w:val="en-US"/>
+        </w:rPr>
+        <w:t xml:space="preserve">If A [n x m], </w:t>
+      </w:r>
+      <w:r>
+        <w:rPr>
+          <w:rFonts w:cstheme="minorHAnsi"/>
+          <w:lang w:val="en-US"/>
+        </w:rPr>
+        <w:t xml:space="preserve">LU-decomposition </w:t>
+      </w:r>
+      <w:r>
+        <w:rPr>
+          <w:rFonts w:cstheme="minorHAnsi"/>
+          <w:lang w:val="en-US"/>
+        </w:rPr>
+        <w:t xml:space="preserve">via partial pivot  </w:t>
+      </w:r>
+      <w:r>
+        <w:rPr>
+          <w:rFonts w:cstheme="minorHAnsi"/>
+          <w:lang w:val="en-US"/>
+        </w:rPr>
+        <w:t xml:space="preserve">is done column by column, but elimination can be done </w:t>
+      </w:r>
+      <w:r>
+        <w:rPr>
+          <w:rFonts w:cstheme="minorHAnsi"/>
+          <w:lang w:val="en-US"/>
+        </w:rPr>
+        <w:t xml:space="preserve">only </w:t>
+      </w:r>
+      <w:r>
+        <w:rPr>
+          <w:rFonts w:cstheme="minorHAnsi"/>
+          <w:lang w:val="en-US"/>
+        </w:rPr>
+        <w:t>while:</w:t>
+      </w:r>
+      <w:r>
+        <w:rPr>
+          <w:rFonts w:cstheme="minorHAnsi"/>
+          <w:lang w:val="en-US"/>
+        </w:rPr>
+        <w:br/>
+        <w:t xml:space="preserve">       there are columns left  (</w:t>
+      </w:r>
+      <w:proofErr w:type="spellStart"/>
+      <w:r>
+        <w:rPr>
+          <w:rFonts w:cstheme="minorHAnsi"/>
+          <w:lang w:val="en-US"/>
+        </w:rPr>
+        <w:t>i</w:t>
+      </w:r>
+      <w:proofErr w:type="spellEnd"/>
+      <w:r>
+        <w:rPr>
+          <w:rFonts w:cstheme="minorHAnsi"/>
+          <w:lang w:val="en-US"/>
+        </w:rPr>
+        <w:t xml:space="preserve"> &lt; m)</w:t>
+      </w:r>
+      <w:r>
+        <w:rPr>
+          <w:rFonts w:cstheme="minorHAnsi"/>
+          <w:lang w:val="en-US"/>
+        </w:rPr>
+        <w:br/>
+        <w:t xml:space="preserve">       there are rows below to eliminate (</w:t>
+      </w:r>
+      <w:proofErr w:type="spellStart"/>
+      <w:r>
+        <w:rPr>
+          <w:rFonts w:cstheme="minorHAnsi"/>
+          <w:lang w:val="en-US"/>
+        </w:rPr>
+        <w:t>i</w:t>
+      </w:r>
+      <w:proofErr w:type="spellEnd"/>
+      <w:r>
+        <w:rPr>
+          <w:rFonts w:cstheme="minorHAnsi"/>
+          <w:lang w:val="en-US"/>
+        </w:rPr>
+        <w:t xml:space="preserve"> &lt; n)</w:t>
+      </w:r>
+    </w:p>
+    <w:p>
+      <w:pPr>
+        <w:pStyle w:val="a7"/>
+        <w:ind w:left="360"/>
+        <w:rPr>
+          <w:rFonts w:cstheme="minorHAnsi"/>
+          <w:lang w:val="en-US"/>
+        </w:rPr>
+      </w:pPr>
+      <w:r>
+        <w:rPr>
+          <w:rFonts w:cstheme="minorHAnsi"/>
+          <w:lang w:val="en-US"/>
+        </w:rPr>
+        <w:t>So</w:t>
+      </w:r>
+      <w:r>
+        <w:rPr>
+          <w:rFonts w:cstheme="minorHAnsi"/>
+          <w:lang w:val="en-US"/>
+        </w:rPr>
+        <w:t xml:space="preserve">, </w:t>
+      </w:r>
+      <w:r>
+        <w:rPr>
+          <w:rFonts w:cstheme="minorHAnsi"/>
+          <w:lang w:val="en-US"/>
+        </w:rPr>
+        <w:t xml:space="preserve">the max number of meaningful </w:t>
+      </w:r>
+      <w:r>
+        <w:rPr>
+          <w:rFonts w:cstheme="minorHAnsi"/>
+          <w:lang w:val="en-US"/>
+        </w:rPr>
+        <w:t xml:space="preserve">iterations </w:t>
+      </w:r>
+      <w:r>
+        <w:rPr>
+          <w:rFonts w:cstheme="minorHAnsi"/>
+          <w:lang w:val="en-US"/>
+        </w:rPr>
+        <w:t>is min(n ,m)</w:t>
+      </w:r>
+      <w:r>
+        <w:rPr>
+          <w:rFonts w:cstheme="minorHAnsi"/>
+          <w:lang w:val="en-US"/>
+        </w:rPr>
+        <w:t>.</w:t>
+      </w:r>
+    </w:p>
+    <w:p>
+      <w:pPr>
+        <w:pStyle w:val="a7"/>
+        <w:numPr>
+          <w:ilvl w:val="0"/>
+          <w:numId w:val="3"/>
+        </w:numPr>
+        <w:rPr>
+          <w:rFonts w:cstheme="minorHAnsi"/>
+          <w:lang w:val="en-US"/>
+        </w:rPr>
+      </w:pPr>
+      <w:r>
+        <w:rPr>
+          <w:rFonts w:cstheme="minorHAnsi"/>
+          <w:lang w:val="en-US"/>
+        </w:rPr>
+        <w:t xml:space="preserve">Notes to the picture below: s = 1 if the number of </w:t>
+      </w:r>
+      <w:r>
+        <w:rPr>
+          <w:rFonts w:cstheme="minorHAnsi"/>
+          <w:lang w:val="en-US"/>
+        </w:rPr>
+        <w:t xml:space="preserve">swaps </w:t>
+      </w:r>
+      <w:r>
+        <w:rPr>
+          <w:rFonts w:cstheme="minorHAnsi"/>
+          <w:lang w:val="en-US"/>
+        </w:rPr>
+        <w:t>was even</w:t>
+      </w:r>
+    </w:p>
+    <w:p>
+      <w:pPr>
+        <w:jc w:val="center"/>
+        <w:rPr>
+          <w:rFonts w:cstheme="minorHAnsi"/>
+          <w:lang w:val="en-US"/>
+        </w:rPr>
+      </w:pPr>
+      <w:r>
+        <w:rPr>
+          <w:rFonts w:cstheme="minorHAnsi"/>
+          <w:lang w:val="en-US"/>
+        </w:rPr>
+        <w:drawing>
+          <wp:inline distT="0" distB="0" distL="0" distR="0" wp14:anchorId="25BE7260" wp14:editId="03E1F2BA">
+            <wp:extent cx="2950234" cy="3246547"/>
+            <wp:effectExtent l="0" t="0" r="2540" b="0"/>
+            <wp:docPr id="1117926640" name="Рисунок 1"/>
+            <wp:cNvGraphicFramePr>
+              <a:graphicFrameLocks xmlns:a="http://schemas.openxmlformats.org/drawingml/2006/main" noChangeAspect="1"/>
+            </wp:cNvGraphicFramePr>
+            <a:graphic xmlns:a="http://schemas.openxmlformats.org/drawingml/2006/main">
+              <a:graphicData uri="http://schemas.openxmlformats.org/drawingml/2006/picture">
+                <pic:pic xmlns:pic="http://schemas.openxmlformats.org/drawingml/2006/picture">
+                  <pic:nvPicPr>
+                    <pic:cNvPr id="1117926640" name=""/>
+                    <pic:cNvPicPr/>
+                  </pic:nvPicPr>
+                  <pic:blipFill>
+                    <a:blip r:embed="rId5"/>
+                    <a:stretch>
+                      <a:fillRect/>
+                    </a:stretch>
+                  </pic:blipFill>
+                  <pic:spPr>
+                    <a:xfrm>
+                      <a:off x="0" y="0"/>
+                      <a:ext cx="2976374" cy="3275313"/>
+                    </a:xfrm>
+                    <a:prstGeom prst="rect">
+                      <a:avLst/>
+                    </a:prstGeom>
+                  </pic:spPr>
+                </pic:pic>
+              </a:graphicData>
+            </a:graphic>
+          </wp:inline>
+        </w:drawing>
+      </w:r>
+    </w:p>
+    <w:p>
+      <w:pPr>
+        <w:pStyle w:val="a7"/>
+        <w:ind w:left="360"/>
+        <w:rPr>
+          <w:rFonts w:cstheme="minorHAnsi"/>
+          <w:lang w:val="en-US"/>
+        </w:rPr>
+      </w:pPr>
     </w:p>
     <w:sectPr>
       <w:pgSz w:w="11906" w:h="16838"/>
@@ -108,6 +354,95 @@
 <file path=word/numbering.xml><?xml version="1.0" encoding="utf-8"?>
 <w:numbering xmlns:wpc="http://schemas.microsoft.com/office/word/2010/wordprocessingCanvas" xmlns:cx="http://schemas.microsoft.com/office/drawing/2014/chartex" xmlns:cx1="http://schemas.microsoft.com/office/drawing/2015/9/8/chartex" xmlns:cx2="http://schemas.microsoft.com/office/drawing/2015/10/21/chartex" xmlns:cx3="http://schemas.microsoft.com/office/drawing/2016/5/9/chartex" xmlns:cx4="http://schemas.microsoft.com/office/drawing/2016/5/10/chartex" xmlns:cx5="http://schemas.microsoft.com/office/drawing/2016/5/11/chartex" xmlns:cx6="http://schemas.microsoft.com/office/drawing/2016/5/12/chartex" xmlns:cx7="http://schemas.microsoft.com/office/drawing/2016/5/13/chartex" xmlns:cx8="http://schemas.microsoft.com/office/drawing/2016/5/14/chartex" xmlns:mc="http://schemas.openxmlformats.org/markup-compatibility/2006" xmlns:aink="http://schemas.microsoft.com/office/drawing/2016/ink" xmlns:am3d="http://schemas.microsoft.com/office/drawing/2017/model3d" xmlns:o="urn:schemas-microsoft-com:office:office" xmlns:oel="http://schemas.microsoft.com/office/2019/extlst" xmlns:r="http://schemas.openxmlformats.org/officeDocument/2006/relationships" xmlns:m="http://schemas.openxmlformats.org/officeDocument/2006/math" xmlns:v="urn:schemas-microsoft-com:vml" xmlns:wp14="http://schemas.microsoft.com/office/word/2010/wordprocessingDrawing" xmlns:wp="http://schemas.openxmlformats.org/drawingml/2006/wordprocessingDrawing" xmlns:w10="urn:schemas-microsoft-com:office:word" xmlns:w="http://schemas.openxmlformats.org/wordprocessingml/2006/main" xmlns:w14="http://schemas.microsoft.com/office/word/2010/wordml" xmlns:w15="http://schemas.microsoft.com/office/word/2012/wordml" xmlns:w16cex="http://schemas.microsoft.com/office/word/2018/wordml/cex" xmlns:w16cid="http://schemas.microsoft.com/office/word/2016/wordml/cid" xmlns:w16="http://schemas.microsoft.com/office/word/2018/wordml" xmlns:w16du="http://schemas.microsoft.com/office/word/2023/wordml/word16du" xmlns:w16sdtdh="http://schemas.microsoft.com/office/word/2020/wordml/sdtdatahash" xmlns:w16sdtfl="http://schemas.microsoft.com/office/word/2024/wordml/sdtformatlock" xmlns:w16se="http://schemas.microsoft.com/office/word/2015/wordml/symex" xmlns:wpg="http://schemas.microsoft.com/office/word/2010/wordprocessingGroup" xmlns:wpi="http://schemas.microsoft.com/office/word/2010/wordprocessingInk" xmlns:wne="http://schemas.microsoft.com/office/word/2006/wordml" xmlns:wps="http://schemas.microsoft.com/office/word/2010/wordprocessingShape" mc:Ignorable="w14 w15 w16se w16cid w16 w16cex w16sdtdh w16sdtfl w16du wp14">
   <w:abstractNum w:abstractNumId="0" w15:restartNumberingAfterBreak="0">
+    <w:nsid w:val="16992351"/>
+    <w:multiLevelType w:val="hybridMultilevel"/>
+    <w:tmpl w:val="1C5A1650"/>
+    <w:lvl w:ilvl="0" w:tplc="04190017">
+      <w:start w:val="1"/>
+      <w:numFmt w:val="lowerLetter"/>
+      <w:lvlText w:val="%1)"/>
+      <w:lvlJc w:val="left"/>
+      <w:pPr>
+        <w:ind w:left="720" w:hanging="360"/>
+      </w:pPr>
+      <w:rPr>
+        <w:rFonts w:hint="default"/>
+      </w:rPr>
+    </w:lvl>
+    <w:lvl w:ilvl="1" w:tplc="04190019" w:tentative="1">
+      <w:start w:val="1"/>
+      <w:numFmt w:val="lowerLetter"/>
+      <w:lvlText w:val="%2."/>
+      <w:lvlJc w:val="left"/>
+      <w:pPr>
+        <w:ind w:left="1440" w:hanging="360"/>
+      </w:pPr>
+    </w:lvl>
+    <w:lvl w:ilvl="2" w:tplc="0419001B" w:tentative="1">
+      <w:start w:val="1"/>
+      <w:numFmt w:val="lowerRoman"/>
+      <w:lvlText w:val="%3."/>
+      <w:lvlJc w:val="right"/>
+      <w:pPr>
+        <w:ind w:left="2160" w:hanging="180"/>
+      </w:pPr>
+    </w:lvl>
+    <w:lvl w:ilvl="3" w:tplc="0419000F" w:tentative="1">
+      <w:start w:val="1"/>
+      <w:numFmt w:val="decimal"/>
+      <w:lvlText w:val="%4."/>
+      <w:lvlJc w:val="left"/>
+      <w:pPr>
+        <w:ind w:left="2880" w:hanging="360"/>
+      </w:pPr>
+    </w:lvl>
+    <w:lvl w:ilvl="4" w:tplc="04190019" w:tentative="1">
+      <w:start w:val="1"/>
+      <w:numFmt w:val="lowerLetter"/>
+      <w:lvlText w:val="%5."/>
+      <w:lvlJc w:val="left"/>
+      <w:pPr>
+        <w:ind w:left="3600" w:hanging="360"/>
+      </w:pPr>
+    </w:lvl>
+    <w:lvl w:ilvl="5" w:tplc="0419001B" w:tentative="1">
+      <w:start w:val="1"/>
+      <w:numFmt w:val="lowerRoman"/>
+      <w:lvlText w:val="%6."/>
+      <w:lvlJc w:val="right"/>
+      <w:pPr>
+        <w:ind w:left="4320" w:hanging="180"/>
+      </w:pPr>
+    </w:lvl>
+    <w:lvl w:ilvl="6" w:tplc="0419000F" w:tentative="1">
+      <w:start w:val="1"/>
+      <w:numFmt w:val="decimal"/>
+      <w:lvlText w:val="%7."/>
+      <w:lvlJc w:val="left"/>
+      <w:pPr>
+        <w:ind w:left="5040" w:hanging="360"/>
+      </w:pPr>
+    </w:lvl>
+    <w:lvl w:ilvl="7" w:tplc="04190019" w:tentative="1">
+      <w:start w:val="1"/>
+      <w:numFmt w:val="lowerLetter"/>
+      <w:lvlText w:val="%8."/>
+      <w:lvlJc w:val="left"/>
+      <w:pPr>
+        <w:ind w:left="5760" w:hanging="360"/>
+      </w:pPr>
+    </w:lvl>
+    <w:lvl w:ilvl="8" w:tplc="0419001B" w:tentative="1">
+      <w:start w:val="1"/>
+      <w:numFmt w:val="lowerRoman"/>
+      <w:lvlText w:val="%9."/>
+      <w:lvlJc w:val="right"/>
+      <w:pPr>
+        <w:ind w:left="6480" w:hanging="180"/>
+      </w:pPr>
+    </w:lvl>
+  </w:abstractNum>
+  <w:abstractNum w:abstractNumId="1" w15:restartNumberingAfterBreak="0">
     <w:nsid w:val="1BEF4942"/>
     <w:multiLevelType w:val="hybridMultilevel"/>
     <w:tmpl w:val="2E5CD26E"/>
@@ -196,7 +531,102 @@
       </w:pPr>
     </w:lvl>
   </w:abstractNum>
+  <w:abstractNum w:abstractNumId="2" w15:restartNumberingAfterBreak="0">
+    <w:nsid w:val="7B1476DF"/>
+    <w:multiLevelType w:val="hybridMultilevel"/>
+    <w:tmpl w:val="2020C9FC"/>
+    <w:lvl w:ilvl="0" w:tplc="04190017">
+      <w:start w:val="1"/>
+      <w:numFmt w:val="lowerLetter"/>
+      <w:lvlText w:val="%1)"/>
+      <w:lvlJc w:val="left"/>
+      <w:pPr>
+        <w:ind w:left="720" w:hanging="360"/>
+      </w:pPr>
+      <w:rPr>
+        <w:rFonts w:hint="default"/>
+      </w:rPr>
+    </w:lvl>
+    <w:lvl w:ilvl="1" w:tplc="04190019" w:tentative="1">
+      <w:start w:val="1"/>
+      <w:numFmt w:val="lowerLetter"/>
+      <w:lvlText w:val="%2."/>
+      <w:lvlJc w:val="left"/>
+      <w:pPr>
+        <w:ind w:left="1440" w:hanging="360"/>
+      </w:pPr>
+    </w:lvl>
+    <w:lvl w:ilvl="2" w:tplc="0419001B" w:tentative="1">
+      <w:start w:val="1"/>
+      <w:numFmt w:val="lowerRoman"/>
+      <w:lvlText w:val="%3."/>
+      <w:lvlJc w:val="right"/>
+      <w:pPr>
+        <w:ind w:left="2160" w:hanging="180"/>
+      </w:pPr>
+    </w:lvl>
+    <w:lvl w:ilvl="3" w:tplc="0419000F" w:tentative="1">
+      <w:start w:val="1"/>
+      <w:numFmt w:val="decimal"/>
+      <w:lvlText w:val="%4."/>
+      <w:lvlJc w:val="left"/>
+      <w:pPr>
+        <w:ind w:left="2880" w:hanging="360"/>
+      </w:pPr>
+    </w:lvl>
+    <w:lvl w:ilvl="4" w:tplc="04190019" w:tentative="1">
+      <w:start w:val="1"/>
+      <w:numFmt w:val="lowerLetter"/>
+      <w:lvlText w:val="%5."/>
+      <w:lvlJc w:val="left"/>
+      <w:pPr>
+        <w:ind w:left="3600" w:hanging="360"/>
+      </w:pPr>
+    </w:lvl>
+    <w:lvl w:ilvl="5" w:tplc="0419001B" w:tentative="1">
+      <w:start w:val="1"/>
+      <w:numFmt w:val="lowerRoman"/>
+      <w:lvlText w:val="%6."/>
+      <w:lvlJc w:val="right"/>
+      <w:pPr>
+        <w:ind w:left="4320" w:hanging="180"/>
+      </w:pPr>
+    </w:lvl>
+    <w:lvl w:ilvl="6" w:tplc="0419000F" w:tentative="1">
+      <w:start w:val="1"/>
+      <w:numFmt w:val="decimal"/>
+      <w:lvlText w:val="%7."/>
+      <w:lvlJc w:val="left"/>
+      <w:pPr>
+        <w:ind w:left="5040" w:hanging="360"/>
+      </w:pPr>
+    </w:lvl>
+    <w:lvl w:ilvl="7" w:tplc="04190019" w:tentative="1">
+      <w:start w:val="1"/>
+      <w:numFmt w:val="lowerLetter"/>
+      <w:lvlText w:val="%8."/>
+      <w:lvlJc w:val="left"/>
+      <w:pPr>
+        <w:ind w:left="5760" w:hanging="360"/>
+      </w:pPr>
+    </w:lvl>
+    <w:lvl w:ilvl="8" w:tplc="0419001B" w:tentative="1">
+      <w:start w:val="1"/>
+      <w:numFmt w:val="lowerRoman"/>
+      <w:lvlText w:val="%9."/>
+      <w:lvlJc w:val="right"/>
+      <w:pPr>
+        <w:ind w:left="6480" w:hanging="180"/>
+      </w:pPr>
+    </w:lvl>
+  </w:abstractNum>
   <w:num w:numId="1" w16cid:durableId="1948001599">
+    <w:abstractNumId w:val="1"/>
+  </w:num>
+  <w:num w:numId="2" w16cid:durableId="1591741730">
+    <w:abstractNumId w:val="2"/>
+  </w:num>
+  <w:num w:numId="3" w16cid:durableId="516775311">
     <w:abstractNumId w:val="0"/>
   </w:num>
 </w:numbering>
@@ -805,6 +1235,7 @@
   <w:style w:type="character" w:default="1" w:styleId="a0">
     <w:name w:val="Default Paragraph Font"/>
     <w:uiPriority w:val="1"/>
+    <w:semiHidden/>
     <w:unhideWhenUsed/>
   </w:style>
   <w:style w:type="table" w:default="1" w:styleId="a1">

</xml_diff>

<commit_message>
Done 3rd item from 2nd task
</commit_message>
<xml_diff>
--- a/System of linear equations/SofLU-doc.docx
+++ b/System of linear equations/SofLU-doc.docx
@@ -317,6 +317,7 @@
       <w:r>
         <w:rPr>
           <w:rFonts w:ascii="Calibri" w:eastAsia="Calibri" w:hAnsi="Calibri" w:cs="Calibri"/>
+          <w:noProof/>
           <w:lang w:val="en-US"/>
         </w:rPr>
         <w:drawing>
@@ -365,6 +366,7 @@
       <w:r>
         <w:rPr>
           <w:rFonts w:ascii="Calibri" w:eastAsia="Calibri" w:hAnsi="Calibri" w:cs="Calibri"/>
+          <w:noProof/>
           <w:lang w:val="en-US"/>
         </w:rPr>
         <w:drawing>
@@ -445,6 +447,7 @@
       <w:r>
         <w:rPr>
           <w:rFonts w:ascii="Calibri" w:eastAsia="Calibri" w:hAnsi="Calibri" w:cs="Calibri"/>
+          <w:noProof/>
           <w:lang w:val="en-US"/>
         </w:rPr>
         <w:drawing>
@@ -493,6 +496,7 @@
       <w:r>
         <w:rPr>
           <w:rFonts w:ascii="Calibri" w:eastAsia="Calibri" w:hAnsi="Calibri" w:cs="Calibri"/>
+          <w:noProof/>
           <w:lang w:val="en-US"/>
         </w:rPr>
         <w:drawing>
@@ -602,6 +606,7 @@
       <w:r>
         <w:rPr>
           <w:rFonts w:ascii="Calibri" w:eastAsia="Calibri" w:hAnsi="Calibri" w:cs="Calibri"/>
+          <w:lang w:val="en-US"/>
         </w:rPr>
         <w:t xml:space="preserve"> </w:t>
       </w:r>
@@ -615,6 +620,7 @@
       <w:r>
         <w:rPr>
           <w:rFonts w:ascii="Calibri" w:eastAsia="Calibri" w:hAnsi="Calibri" w:cs="Calibri"/>
+          <w:lang w:val="en-US"/>
         </w:rPr>
         <w:t xml:space="preserve">. </w:t>
       </w:r>
@@ -672,14 +678,7 @@
           <w:rFonts w:ascii="Calibri" w:eastAsia="Calibri" w:hAnsi="Calibri" w:cs="Calibri"/>
           <w:lang w:val="en-US"/>
         </w:rPr>
-        <w:t>,</w:t>
-      </w:r>
-      <w:r>
-        <w:rPr>
-          <w:rFonts w:ascii="Calibri" w:eastAsia="Calibri" w:hAnsi="Calibri" w:cs="Calibri"/>
-          <w:lang w:val="en-US"/>
-        </w:rPr>
-        <w:t xml:space="preserve"> </w:t>
+        <w:t xml:space="preserve">, </w:t>
       </w:r>
       <w:r>
         <w:rPr>
@@ -1497,7 +1496,7 @@
         <w:pStyle w:val="a3"/>
         <w:numPr>
           <w:ilvl w:val="0"/>
-          <w:numId w:val="6"/>
+          <w:numId w:val="7"/>
         </w:numPr>
         <w:rPr>
           <w:rFonts w:ascii="Calibri" w:eastAsia="Calibri" w:hAnsi="Calibri" w:cs="Calibri"/>
@@ -1547,7 +1546,7 @@
         <w:pStyle w:val="a3"/>
         <w:numPr>
           <w:ilvl w:val="0"/>
-          <w:numId w:val="6"/>
+          <w:numId w:val="7"/>
         </w:numPr>
         <w:rPr>
           <w:rFonts w:ascii="Calibri" w:eastAsia="Calibri" w:hAnsi="Calibri" w:cs="Calibri"/>
@@ -1567,7 +1566,7 @@
         <w:pStyle w:val="a3"/>
         <w:numPr>
           <w:ilvl w:val="0"/>
-          <w:numId w:val="6"/>
+          <w:numId w:val="7"/>
         </w:numPr>
         <w:rPr>
           <w:rFonts w:ascii="Calibri" w:eastAsia="Calibri" w:hAnsi="Calibri" w:cs="Calibri"/>
@@ -1588,6 +1587,1096 @@
         </w:rPr>
         <w:t>.</w:t>
       </w:r>
+    </w:p>
+    <w:p>
+      <w:pPr>
+        <w:pStyle w:val="a3"/>
+        <w:numPr>
+          <w:ilvl w:val="0"/>
+          <w:numId w:val="5"/>
+        </w:numPr>
+        <w:rPr>
+          <w:rFonts w:ascii="Calibri" w:eastAsia="Calibri" w:hAnsi="Calibri" w:cs="Calibri"/>
+          <w:lang w:val="en-US"/>
+        </w:rPr>
+      </w:pPr>
+      <w:r>
+        <w:rPr>
+          <w:rFonts w:ascii="Calibri" w:eastAsia="Calibri" w:hAnsi="Calibri" w:cs="Calibri"/>
+          <w:lang w:val="en-US"/>
+        </w:rPr>
+        <w:t xml:space="preserve">Householder reflections </w:t>
+      </w:r>
+      <w:r>
+        <w:rPr>
+          <w:rFonts w:ascii="Calibri" w:eastAsia="Calibri" w:hAnsi="Calibri" w:cs="Calibri"/>
+          <w:lang w:val="en-US"/>
+        </w:rPr>
+        <w:t>to make QR</w:t>
+      </w:r>
+      <w:r>
+        <w:rPr>
+          <w:rFonts w:ascii="Calibri" w:eastAsia="Calibri" w:hAnsi="Calibri" w:cs="Calibri"/>
+          <w:lang w:val="en-US"/>
+        </w:rPr>
+        <w:t>-</w:t>
+      </w:r>
+      <w:r>
+        <w:rPr>
+          <w:rFonts w:ascii="Calibri" w:eastAsia="Calibri" w:hAnsi="Calibri" w:cs="Calibri"/>
+          <w:lang w:val="en-US"/>
+        </w:rPr>
+        <w:t>decomposition</w:t>
+      </w:r>
+      <w:r>
+        <w:rPr>
+          <w:rFonts w:ascii="Calibri" w:eastAsia="Calibri" w:hAnsi="Calibri" w:cs="Calibri"/>
+          <w:lang w:val="en-US"/>
+        </w:rPr>
+        <w:t xml:space="preserve"> remove a whole column at once, require fewer transformations and are best for dense matrices.</w:t>
+      </w:r>
+      <w:r>
+        <w:rPr>
+          <w:rFonts w:ascii="Calibri" w:eastAsia="Calibri" w:hAnsi="Calibri" w:cs="Calibri"/>
+          <w:lang w:val="en-US"/>
+        </w:rPr>
+        <w:t xml:space="preserve"> It’s faster than Givens rotations.</w:t>
+      </w:r>
+    </w:p>
+    <w:p>
+      <w:pPr>
+        <w:pStyle w:val="a3"/>
+        <w:ind w:left="0"/>
+        <w:rPr>
+          <w:rFonts w:ascii="Calibri" w:eastAsia="Calibri" w:hAnsi="Calibri" w:cs="Calibri"/>
+          <w:lang w:val="en-US"/>
+        </w:rPr>
+      </w:pPr>
+      <w:r>
+        <w:rPr>
+          <w:rFonts w:ascii="Calibri" w:eastAsia="Calibri" w:hAnsi="Calibri" w:cs="Calibri"/>
+          <w:lang w:val="en-US"/>
+        </w:rPr>
+        <w:drawing>
+          <wp:inline distT="0" distB="0" distL="0" distR="0" wp14:anchorId="239D904D" wp14:editId="0F4022E5">
+            <wp:extent cx="2889849" cy="1732489"/>
+            <wp:effectExtent l="0" t="0" r="0" b="0"/>
+            <wp:docPr id="1254491406" name="Рисунок 1"/>
+            <wp:cNvGraphicFramePr>
+              <a:graphicFrameLocks xmlns:a="http://schemas.openxmlformats.org/drawingml/2006/main" noChangeAspect="1"/>
+            </wp:cNvGraphicFramePr>
+            <a:graphic xmlns:a="http://schemas.openxmlformats.org/drawingml/2006/main">
+              <a:graphicData uri="http://schemas.openxmlformats.org/drawingml/2006/picture">
+                <pic:pic xmlns:pic="http://schemas.openxmlformats.org/drawingml/2006/picture">
+                  <pic:nvPicPr>
+                    <pic:cNvPr id="1254491406" name=""/>
+                    <pic:cNvPicPr/>
+                  </pic:nvPicPr>
+                  <pic:blipFill>
+                    <a:blip r:embed="rId10"/>
+                    <a:stretch>
+                      <a:fillRect/>
+                    </a:stretch>
+                  </pic:blipFill>
+                  <pic:spPr>
+                    <a:xfrm>
+                      <a:off x="0" y="0"/>
+                      <a:ext cx="2895027" cy="1735593"/>
+                    </a:xfrm>
+                    <a:prstGeom prst="rect">
+                      <a:avLst/>
+                    </a:prstGeom>
+                  </pic:spPr>
+                </pic:pic>
+              </a:graphicData>
+            </a:graphic>
+          </wp:inline>
+        </w:drawing>
+      </w:r>
+      <w:r>
+        <w:rPr>
+          <w:rFonts w:ascii="Calibri" w:eastAsia="Calibri" w:hAnsi="Calibri" w:cs="Calibri"/>
+          <w:lang w:val="en-US"/>
+        </w:rPr>
+        <w:t xml:space="preserve">   </w:t>
+      </w:r>
+      <w:r>
+        <w:rPr>
+          <w:rFonts w:ascii="Calibri" w:eastAsia="Calibri" w:hAnsi="Calibri" w:cs="Calibri"/>
+          <w:lang w:val="en-US"/>
+        </w:rPr>
+        <w:drawing>
+          <wp:inline distT="0" distB="0" distL="0" distR="0" wp14:anchorId="6E2F1A35" wp14:editId="200D6063">
+            <wp:extent cx="1200318" cy="828791"/>
+            <wp:effectExtent l="0" t="0" r="0" b="9525"/>
+            <wp:docPr id="1100431949" name="Рисунок 1"/>
+            <wp:cNvGraphicFramePr>
+              <a:graphicFrameLocks xmlns:a="http://schemas.openxmlformats.org/drawingml/2006/main" noChangeAspect="1"/>
+            </wp:cNvGraphicFramePr>
+            <a:graphic xmlns:a="http://schemas.openxmlformats.org/drawingml/2006/main">
+              <a:graphicData uri="http://schemas.openxmlformats.org/drawingml/2006/picture">
+                <pic:pic xmlns:pic="http://schemas.openxmlformats.org/drawingml/2006/picture">
+                  <pic:nvPicPr>
+                    <pic:cNvPr id="1100431949" name=""/>
+                    <pic:cNvPicPr/>
+                  </pic:nvPicPr>
+                  <pic:blipFill>
+                    <a:blip r:embed="rId11"/>
+                    <a:stretch>
+                      <a:fillRect/>
+                    </a:stretch>
+                  </pic:blipFill>
+                  <pic:spPr>
+                    <a:xfrm>
+                      <a:off x="0" y="0"/>
+                      <a:ext cx="1200318" cy="828791"/>
+                    </a:xfrm>
+                    <a:prstGeom prst="rect">
+                      <a:avLst/>
+                    </a:prstGeom>
+                  </pic:spPr>
+                </pic:pic>
+              </a:graphicData>
+            </a:graphic>
+          </wp:inline>
+        </w:drawing>
+      </w:r>
+    </w:p>
+    <w:p>
+      <w:pPr>
+        <w:pStyle w:val="a3"/>
+        <w:ind w:left="0"/>
+        <w:rPr>
+          <w:rFonts w:ascii="Calibri" w:eastAsia="Calibri" w:hAnsi="Calibri" w:cs="Calibri"/>
+          <w:lang w:val="en-US"/>
+        </w:rPr>
+      </w:pPr>
+      <w:r>
+        <w:rPr>
+          <w:rFonts w:ascii="Calibri" w:eastAsia="Calibri" w:hAnsi="Calibri" w:cs="Calibri"/>
+          <w:lang w:val="en-US"/>
+        </w:rPr>
+        <w:t xml:space="preserve">The first i-1 rows/cols are left unchanged; only the lower block P_v is transformed. P_v is the </w:t>
+      </w:r>
+      <w:r>
+        <w:rPr>
+          <w:rFonts w:ascii="Calibri" w:eastAsia="Calibri" w:hAnsi="Calibri" w:cs="Calibri"/>
+          <w:lang w:val="en-US"/>
+        </w:rPr>
+        <w:t>Householder reflector acting on the subvector starting at row</w:t>
+      </w:r>
+      <w:r>
+        <w:rPr>
+          <w:rFonts w:ascii="Calibri" w:eastAsia="Calibri" w:hAnsi="Calibri" w:cs="Calibri"/>
+          <w:lang w:val="en-US"/>
+        </w:rPr>
+        <w:t xml:space="preserve"> i.</w:t>
+      </w:r>
+    </w:p>
+    <w:p>
+      <w:pPr>
+        <w:pStyle w:val="a3"/>
+        <w:ind w:left="0"/>
+        <w:rPr>
+          <w:rFonts w:ascii="Calibri" w:eastAsia="Calibri" w:hAnsi="Calibri" w:cs="Calibri"/>
+          <w:lang w:val="en-US"/>
+        </w:rPr>
+      </w:pPr>
+      <w:r>
+        <w:rPr>
+          <w:rFonts w:ascii="Calibri" w:eastAsia="Calibri" w:hAnsi="Calibri" w:cs="Calibri"/>
+          <w:lang w:val="en-US"/>
+        </w:rPr>
+        <w:t>Algorithm:</w:t>
+      </w:r>
+    </w:p>
+    <w:p>
+      <w:pPr>
+        <w:pStyle w:val="a3"/>
+        <w:numPr>
+          <w:ilvl w:val="0"/>
+          <w:numId w:val="9"/>
+        </w:numPr>
+        <w:rPr>
+          <w:rFonts w:ascii="Calibri" w:eastAsia="Calibri" w:hAnsi="Calibri" w:cs="Calibri"/>
+          <w:lang w:val="en-US"/>
+        </w:rPr>
+      </w:pPr>
+      <w:r>
+        <w:rPr>
+          <w:rFonts w:ascii="Calibri" w:eastAsia="Calibri" w:hAnsi="Calibri" w:cs="Calibri"/>
+          <w:lang w:val="en-US"/>
+        </w:rPr>
+        <w:t>Q = I, R= A</w:t>
+      </w:r>
+    </w:p>
+    <w:p>
+      <w:pPr>
+        <w:pStyle w:val="a3"/>
+        <w:numPr>
+          <w:ilvl w:val="0"/>
+          <w:numId w:val="9"/>
+        </w:numPr>
+        <w:rPr>
+          <w:rFonts w:ascii="Calibri" w:eastAsia="Calibri" w:hAnsi="Calibri" w:cs="Calibri"/>
+          <w:lang w:val="en-US"/>
+        </w:rPr>
+      </w:pPr>
+      <w:r>
+        <w:rPr>
+          <w:rFonts w:ascii="Calibri" w:eastAsia="Calibri" w:hAnsi="Calibri" w:cs="Calibri"/>
+          <w:lang w:val="en-US"/>
+        </w:rPr>
+        <w:t>For each column i:</w:t>
+      </w:r>
+    </w:p>
+    <w:p>
+      <w:pPr>
+        <w:pStyle w:val="a3"/>
+        <w:numPr>
+          <w:ilvl w:val="1"/>
+          <w:numId w:val="8"/>
+        </w:numPr>
+        <w:rPr>
+          <w:rFonts w:ascii="Calibri" w:eastAsia="Calibri" w:hAnsi="Calibri" w:cs="Calibri"/>
+          <w:lang w:val="en-US"/>
+        </w:rPr>
+      </w:pPr>
+      <w:r>
+        <w:rPr>
+          <w:rFonts w:ascii="Calibri" w:eastAsia="Calibri" w:hAnsi="Calibri" w:cs="Calibri"/>
+          <w:lang w:val="en-US"/>
+        </w:rPr>
+        <w:lastRenderedPageBreak/>
+        <w:t>take the column segment below the diagonal</w:t>
+      </w:r>
+    </w:p>
+    <w:p>
+      <w:pPr>
+        <w:pStyle w:val="a3"/>
+        <w:numPr>
+          <w:ilvl w:val="1"/>
+          <w:numId w:val="8"/>
+        </w:numPr>
+        <w:rPr>
+          <w:rFonts w:ascii="Calibri" w:eastAsia="Calibri" w:hAnsi="Calibri" w:cs="Calibri"/>
+          <w:lang w:val="en-US"/>
+        </w:rPr>
+      </w:pPr>
+      <w:r>
+        <w:rPr>
+          <w:rFonts w:ascii="Calibri" w:eastAsia="Calibri" w:hAnsi="Calibri" w:cs="Calibri"/>
+          <w:lang w:val="en-US"/>
+        </w:rPr>
+        <w:t xml:space="preserve">build a Householder reflector </w:t>
+      </w:r>
+      <w:r>
+        <w:rPr>
+          <w:rFonts w:ascii="Calibri" w:eastAsia="Calibri" w:hAnsi="Calibri" w:cs="Calibri"/>
+          <w:lang w:val="en-US"/>
+        </w:rPr>
+        <w:t>H_i</w:t>
+      </w:r>
+    </w:p>
+    <w:p>
+      <w:pPr>
+        <w:pStyle w:val="a3"/>
+        <w:numPr>
+          <w:ilvl w:val="1"/>
+          <w:numId w:val="8"/>
+        </w:numPr>
+        <w:rPr>
+          <w:rFonts w:ascii="Calibri" w:eastAsia="Calibri" w:hAnsi="Calibri" w:cs="Calibri"/>
+          <w:lang w:val="en-US"/>
+        </w:rPr>
+      </w:pPr>
+      <w:r>
+        <w:rPr>
+          <w:rFonts w:ascii="Calibri" w:eastAsia="Calibri" w:hAnsi="Calibri" w:cs="Calibri"/>
+          <w:lang w:val="en-US"/>
+        </w:rPr>
+        <w:t>apply it to zero out entries below the diagonal in column</w:t>
+      </w:r>
+      <w:r>
+        <w:rPr>
+          <w:rFonts w:ascii="Calibri" w:eastAsia="Calibri" w:hAnsi="Calibri" w:cs="Calibri"/>
+          <w:lang w:val="en-US"/>
+        </w:rPr>
+        <w:t xml:space="preserve"> i</w:t>
+      </w:r>
+    </w:p>
+    <w:p>
+      <w:pPr>
+        <w:pStyle w:val="a3"/>
+        <w:numPr>
+          <w:ilvl w:val="0"/>
+          <w:numId w:val="9"/>
+        </w:numPr>
+        <w:rPr>
+          <w:rFonts w:ascii="Calibri" w:eastAsia="Calibri" w:hAnsi="Calibri" w:cs="Calibri"/>
+          <w:lang w:val="en-US"/>
+        </w:rPr>
+      </w:pPr>
+      <w:r>
+        <w:rPr>
+          <w:rFonts w:ascii="Calibri" w:eastAsia="Calibri" w:hAnsi="Calibri" w:cs="Calibri"/>
+          <w:lang w:val="en-US"/>
+        </w:rPr>
+        <w:t>Multiply all reflectors together to form</w:t>
+      </w:r>
+      <w:r>
+        <w:rPr>
+          <w:rFonts w:ascii="Calibri" w:eastAsia="Calibri" w:hAnsi="Calibri" w:cs="Calibri"/>
+          <w:lang w:val="en-US"/>
+        </w:rPr>
+        <w:t xml:space="preserve"> Q</w:t>
+      </w:r>
+    </w:p>
+    <w:p>
+      <w:pPr>
+        <w:ind w:left="360"/>
+        <w:rPr>
+          <w:rFonts w:ascii="Calibri" w:eastAsia="Calibri" w:hAnsi="Calibri" w:cs="Calibri"/>
+          <w:lang w:val="en-US"/>
+        </w:rPr>
+      </w:pPr>
+      <w:r>
+        <w:rPr>
+          <w:rFonts w:ascii="Calibri" w:eastAsia="Calibri" w:hAnsi="Calibri" w:cs="Calibri"/>
+          <w:lang w:val="en-US"/>
+        </w:rPr>
+        <w:t xml:space="preserve">Because H_i is orthogonal, </w:t>
+      </w:r>
+      <w:r>
+        <w:rPr>
+          <w:rFonts w:ascii="Calibri" w:eastAsia="Calibri" w:hAnsi="Calibri" w:cs="Calibri"/>
+          <w:lang w:val="en-US"/>
+        </w:rPr>
+        <w:t>H</w:t>
+      </w:r>
+      <w:r>
+        <w:rPr>
+          <w:rFonts w:ascii="Calibri" w:eastAsia="Calibri" w:hAnsi="Calibri" w:cs="Calibri"/>
+          <w:lang w:val="en-US"/>
+        </w:rPr>
+        <w:t xml:space="preserve">_i * (H_i)^T = I, their product is also orthogonal. </w:t>
+      </w:r>
+    </w:p>
+    <w:p>
+      <w:pPr>
+        <w:ind w:left="360"/>
+        <w:rPr>
+          <w:rFonts w:ascii="Calibri" w:eastAsia="Calibri" w:hAnsi="Calibri" w:cs="Calibri"/>
+          <w:lang w:val="en-US"/>
+        </w:rPr>
+      </w:pPr>
+      <w:r>
+        <w:rPr>
+          <w:rFonts w:ascii="Calibri" w:eastAsia="Calibri" w:hAnsi="Calibri" w:cs="Calibri"/>
+          <w:lang w:val="en-US"/>
+        </w:rPr>
+        <w:t>If R = H_</w:t>
+      </w:r>
+      <w:r>
+        <w:rPr>
+          <w:rFonts w:ascii="Calibri" w:eastAsia="Calibri" w:hAnsi="Calibri" w:cs="Calibri"/>
+          <w:lang w:val="en-US"/>
+        </w:rPr>
+        <w:t>t</w:t>
+      </w:r>
+      <w:r>
+        <w:rPr>
+          <w:rFonts w:ascii="Calibri" w:eastAsia="Calibri" w:hAnsi="Calibri" w:cs="Calibri"/>
+          <w:lang w:val="en-US"/>
+        </w:rPr>
+        <w:t xml:space="preserve"> * … * H_1 * A, then A = (H_1)^T * … * (H_</w:t>
+      </w:r>
+      <w:r>
+        <w:rPr>
+          <w:rFonts w:ascii="Calibri" w:eastAsia="Calibri" w:hAnsi="Calibri" w:cs="Calibri"/>
+          <w:lang w:val="en-US"/>
+        </w:rPr>
+        <w:t>t</w:t>
+      </w:r>
+      <w:r>
+        <w:rPr>
+          <w:rFonts w:ascii="Calibri" w:eastAsia="Calibri" w:hAnsi="Calibri" w:cs="Calibri"/>
+          <w:lang w:val="en-US"/>
+        </w:rPr>
+        <w:t xml:space="preserve">)^T * R. So Q = </w:t>
+      </w:r>
+      <w:r>
+        <w:rPr>
+          <w:rFonts w:ascii="Calibri" w:eastAsia="Calibri" w:hAnsi="Calibri" w:cs="Calibri"/>
+          <w:lang w:val="en-US"/>
+        </w:rPr>
+        <w:t>(H_1)^T * … * (H_</w:t>
+      </w:r>
+      <w:r>
+        <w:rPr>
+          <w:rFonts w:ascii="Calibri" w:eastAsia="Calibri" w:hAnsi="Calibri" w:cs="Calibri"/>
+          <w:lang w:val="en-US"/>
+        </w:rPr>
+        <w:t>t</w:t>
+      </w:r>
+      <w:r>
+        <w:rPr>
+          <w:rFonts w:ascii="Calibri" w:eastAsia="Calibri" w:hAnsi="Calibri" w:cs="Calibri"/>
+          <w:lang w:val="en-US"/>
+        </w:rPr>
+        <w:t>)^T</w:t>
+      </w:r>
+      <w:r>
+        <w:rPr>
+          <w:rFonts w:ascii="Calibri" w:eastAsia="Calibri" w:hAnsi="Calibri" w:cs="Calibri"/>
+          <w:lang w:val="en-US"/>
+        </w:rPr>
+        <w:t>,</w:t>
+      </w:r>
+    </w:p>
+    <w:p>
+      <w:pPr>
+        <w:ind w:left="360"/>
+        <w:rPr>
+          <w:rFonts w:ascii="Calibri" w:eastAsia="Calibri" w:hAnsi="Calibri" w:cs="Calibri"/>
+          <w:lang w:val="en-US"/>
+        </w:rPr>
+      </w:pPr>
+      <w:r>
+        <w:rPr>
+          <w:rFonts w:ascii="Calibri" w:eastAsia="Calibri" w:hAnsi="Calibri" w:cs="Calibri"/>
+          <w:lang w:val="en-US"/>
+        </w:rPr>
+        <w:t xml:space="preserve">t = n-1. </w:t>
+      </w:r>
+      <w:r>
+        <w:rPr>
+          <w:rFonts w:ascii="Calibri" w:eastAsia="Calibri" w:hAnsi="Calibri" w:cs="Calibri"/>
+          <w:lang w:val="en-US"/>
+        </w:rPr>
+        <w:t xml:space="preserve">Because Householder reflectors are symmetric, </w:t>
+      </w:r>
+      <m:oMath>
+        <m:sSubSup>
+          <m:sSubSupPr>
+            <m:ctrlPr>
+              <w:rPr>
+                <w:rFonts w:ascii="Cambria Math" w:eastAsia="Calibri" w:hAnsi="Cambria Math" w:cs="Calibri"/>
+              </w:rPr>
+            </m:ctrlPr>
+          </m:sSubSupPr>
+          <m:e>
+            <m:r>
+              <w:rPr>
+                <w:rFonts w:ascii="Cambria Math" w:eastAsia="Calibri" w:hAnsi="Cambria Math" w:cs="Calibri"/>
+              </w:rPr>
+              <m:t>H</m:t>
+            </m:r>
+          </m:e>
+          <m:sub>
+            <m:r>
+              <w:rPr>
+                <w:rFonts w:ascii="Cambria Math" w:eastAsia="Calibri" w:hAnsi="Cambria Math" w:cs="Calibri"/>
+              </w:rPr>
+              <m:t>i</m:t>
+            </m:r>
+          </m:sub>
+          <m:sup>
+            <m:r>
+              <w:rPr>
+                <w:rFonts w:ascii="Cambria Math" w:eastAsia="Calibri" w:hAnsi="Cambria Math" w:cs="Calibri"/>
+              </w:rPr>
+              <m:t>T</m:t>
+            </m:r>
+          </m:sup>
+        </m:sSubSup>
+        <m:r>
+          <w:rPr>
+            <w:rFonts w:ascii="Cambria Math" w:eastAsia="Calibri" w:hAnsi="Cambria Math" w:cs="Calibri"/>
+            <w:lang w:val="en-US"/>
+          </w:rPr>
+          <m:t>=</m:t>
+        </m:r>
+        <m:sSub>
+          <m:sSubPr>
+            <m:ctrlPr>
+              <w:rPr>
+                <w:rFonts w:ascii="Cambria Math" w:eastAsia="Calibri" w:hAnsi="Cambria Math" w:cs="Calibri"/>
+              </w:rPr>
+            </m:ctrlPr>
+          </m:sSubPr>
+          <m:e>
+            <m:r>
+              <w:rPr>
+                <w:rFonts w:ascii="Cambria Math" w:eastAsia="Calibri" w:hAnsi="Cambria Math" w:cs="Calibri"/>
+              </w:rPr>
+              <m:t>H</m:t>
+            </m:r>
+          </m:e>
+          <m:sub>
+            <m:r>
+              <w:rPr>
+                <w:rFonts w:ascii="Cambria Math" w:eastAsia="Calibri" w:hAnsi="Cambria Math" w:cs="Calibri"/>
+              </w:rPr>
+              <m:t>i</m:t>
+            </m:r>
+          </m:sub>
+        </m:sSub>
+      </m:oMath>
+      <w:r>
+        <w:rPr>
+          <w:rFonts w:ascii="Calibri" w:eastAsia="Calibri" w:hAnsi="Calibri" w:cs="Calibri"/>
+          <w:lang w:val="en-US"/>
+        </w:rPr>
+        <w:t>.</w:t>
+      </w:r>
+    </w:p>
+    <w:p>
+      <w:pPr>
+        <w:ind w:left="360"/>
+        <w:rPr>
+          <w:rFonts w:ascii="Calibri" w:eastAsia="Calibri" w:hAnsi="Calibri" w:cs="Calibri"/>
+          <w:lang w:val="en-US"/>
+        </w:rPr>
+      </w:pPr>
+      <w:r>
+        <w:rPr>
+          <w:rFonts w:ascii="Calibri" w:eastAsia="Calibri" w:hAnsi="Calibri" w:cs="Calibri"/>
+          <w:lang w:val="en-US"/>
+        </w:rPr>
+        <w:t xml:space="preserve">At each step, Householder reflector </w:t>
+      </w:r>
+      <m:oMath>
+        <m:sSub>
+          <m:sSubPr>
+            <m:ctrlPr>
+              <w:rPr>
+                <w:rFonts w:ascii="Cambria Math" w:eastAsia="Calibri" w:hAnsi="Cambria Math" w:cs="Calibri"/>
+              </w:rPr>
+            </m:ctrlPr>
+          </m:sSubPr>
+          <m:e>
+            <m:r>
+              <w:rPr>
+                <w:rFonts w:ascii="Cambria Math" w:eastAsia="Calibri" w:hAnsi="Cambria Math" w:cs="Calibri"/>
+              </w:rPr>
+              <m:t>H</m:t>
+            </m:r>
+          </m:e>
+          <m:sub>
+            <m:r>
+              <w:rPr>
+                <w:rFonts w:ascii="Cambria Math" w:eastAsia="Calibri" w:hAnsi="Cambria Math" w:cs="Calibri"/>
+              </w:rPr>
+              <m:t>i</m:t>
+            </m:r>
+          </m:sub>
+        </m:sSub>
+      </m:oMath>
+      <w:r>
+        <w:rPr>
+          <w:rFonts w:ascii="Calibri" w:eastAsia="Calibri" w:hAnsi="Calibri" w:cs="Calibri"/>
+          <w:lang w:val="en-US"/>
+        </w:rPr>
+        <w:t xml:space="preserve"> is applied </w:t>
+      </w:r>
+      <w:r>
+        <w:rPr>
+          <w:rFonts w:ascii="Calibri" w:eastAsia="Calibri" w:hAnsi="Calibri" w:cs="Calibri"/>
+          <w:lang w:val="en-US"/>
+        </w:rPr>
+        <w:t>from the left</w:t>
+      </w:r>
+      <w:r>
+        <w:rPr>
+          <w:rFonts w:ascii="Calibri" w:eastAsia="Calibri" w:hAnsi="Calibri" w:cs="Calibri"/>
+          <w:lang w:val="en-US"/>
+        </w:rPr>
+        <w:t>:</w:t>
+      </w:r>
+    </w:p>
+    <w:p>
+      <w:pPr>
+        <w:ind w:left="360"/>
+        <w:rPr>
+          <w:rFonts w:ascii="Calibri" w:eastAsia="Calibri" w:hAnsi="Calibri" w:cs="Calibri"/>
+          <w:lang w:val="en-US"/>
+        </w:rPr>
+      </w:pPr>
+      <m:oMathPara>
+        <m:oMath>
+          <m:sSub>
+            <m:sSubPr>
+              <m:ctrlPr>
+                <w:rPr>
+                  <w:rFonts w:ascii="Cambria Math" w:eastAsia="Calibri" w:hAnsi="Cambria Math" w:cs="Calibri"/>
+                  <w:i/>
+                  <w:lang w:val="en-US"/>
+                </w:rPr>
+              </m:ctrlPr>
+            </m:sSubPr>
+            <m:e>
+              <m:r>
+                <w:rPr>
+                  <w:rFonts w:ascii="Cambria Math" w:eastAsia="Calibri" w:hAnsi="Cambria Math" w:cs="Calibri"/>
+                  <w:lang w:val="en-US"/>
+                </w:rPr>
+                <m:t>H</m:t>
+              </m:r>
+            </m:e>
+            <m:sub>
+              <m:r>
+                <w:rPr>
+                  <w:rFonts w:ascii="Cambria Math" w:eastAsia="Calibri" w:hAnsi="Cambria Math" w:cs="Calibri"/>
+                  <w:lang w:val="en-US"/>
+                </w:rPr>
+                <m:t>i</m:t>
+              </m:r>
+            </m:sub>
+          </m:sSub>
+          <m:r>
+            <w:rPr>
+              <w:rFonts w:ascii="Cambria Math" w:eastAsia="Calibri" w:hAnsi="Cambria Math" w:cs="Calibri"/>
+              <w:lang w:val="en-US"/>
+            </w:rPr>
+            <m:t xml:space="preserve"> </m:t>
+          </m:r>
+          <m:sSub>
+            <m:sSubPr>
+              <m:ctrlPr>
+                <w:rPr>
+                  <w:rFonts w:ascii="Cambria Math" w:eastAsia="Calibri" w:hAnsi="Cambria Math" w:cs="Calibri"/>
+                  <w:i/>
+                  <w:lang w:val="en-US"/>
+                </w:rPr>
+              </m:ctrlPr>
+            </m:sSubPr>
+            <m:e>
+              <m:r>
+                <w:rPr>
+                  <w:rFonts w:ascii="Cambria Math" w:eastAsia="Calibri" w:hAnsi="Cambria Math" w:cs="Calibri"/>
+                  <w:lang w:val="en-US"/>
+                </w:rPr>
+                <m:t>A</m:t>
+              </m:r>
+            </m:e>
+            <m:sub>
+              <m:r>
+                <w:rPr>
+                  <w:rFonts w:ascii="Cambria Math" w:eastAsia="Calibri" w:hAnsi="Cambria Math" w:cs="Calibri"/>
+                  <w:lang w:val="en-US"/>
+                </w:rPr>
+                <m:t>i-1</m:t>
+              </m:r>
+            </m:sub>
+          </m:sSub>
+          <m:r>
+            <w:rPr>
+              <w:rFonts w:ascii="Cambria Math" w:eastAsia="Calibri" w:hAnsi="Cambria Math" w:cs="Calibri"/>
+              <w:lang w:val="en-US"/>
+            </w:rPr>
+            <m:t>=</m:t>
+          </m:r>
+          <m:sSub>
+            <m:sSubPr>
+              <m:ctrlPr>
+                <w:rPr>
+                  <w:rFonts w:ascii="Cambria Math" w:eastAsia="Calibri" w:hAnsi="Cambria Math" w:cs="Calibri"/>
+                  <w:i/>
+                  <w:lang w:val="en-US"/>
+                </w:rPr>
+              </m:ctrlPr>
+            </m:sSubPr>
+            <m:e>
+              <m:r>
+                <w:rPr>
+                  <w:rFonts w:ascii="Cambria Math" w:eastAsia="Calibri" w:hAnsi="Cambria Math" w:cs="Calibri"/>
+                  <w:lang w:val="en-US"/>
+                </w:rPr>
+                <m:t>A</m:t>
+              </m:r>
+            </m:e>
+            <m:sub>
+              <m:r>
+                <w:rPr>
+                  <w:rFonts w:ascii="Cambria Math" w:eastAsia="Calibri" w:hAnsi="Cambria Math" w:cs="Calibri"/>
+                  <w:lang w:val="en-US"/>
+                </w:rPr>
+                <m:t>i</m:t>
+              </m:r>
+            </m:sub>
+          </m:sSub>
+        </m:oMath>
+      </m:oMathPara>
+    </w:p>
+    <w:p>
+      <w:pPr>
+        <w:ind w:left="360"/>
+        <w:rPr>
+          <w:rFonts w:ascii="Calibri" w:eastAsia="Calibri" w:hAnsi="Calibri" w:cs="Calibri"/>
+          <w:lang w:val="en-US"/>
+        </w:rPr>
+      </w:pPr>
+      <w:r>
+        <w:rPr>
+          <w:rFonts w:ascii="Calibri" w:eastAsia="Calibri" w:hAnsi="Calibri" w:cs="Calibri"/>
+          <w:lang w:val="en-US"/>
+        </w:rPr>
+        <w:t>where A_0 = A and each A_i has more zeros below the diagonal.</w:t>
+      </w:r>
+    </w:p>
+    <w:p>
+      <w:pPr>
+        <w:ind w:left="360"/>
+        <w:rPr>
+          <w:rFonts w:ascii="Calibri" w:eastAsia="Calibri" w:hAnsi="Calibri" w:cs="Calibri"/>
+          <w:lang w:val="en-US"/>
+        </w:rPr>
+      </w:pPr>
+      <w:r>
+        <w:rPr>
+          <w:rFonts w:ascii="Calibri" w:eastAsia="Calibri" w:hAnsi="Calibri" w:cs="Calibri"/>
+          <w:lang w:val="en-US"/>
+        </w:rPr>
+        <w:drawing>
+          <wp:inline distT="0" distB="0" distL="0" distR="0" wp14:anchorId="7112AA65" wp14:editId="5F2CC7F2">
+            <wp:extent cx="5940425" cy="4453255"/>
+            <wp:effectExtent l="0" t="0" r="0" b="0"/>
+            <wp:docPr id="138525515" name="Рисунок 1"/>
+            <wp:cNvGraphicFramePr>
+              <a:graphicFrameLocks xmlns:a="http://schemas.openxmlformats.org/drawingml/2006/main" noChangeAspect="1"/>
+            </wp:cNvGraphicFramePr>
+            <a:graphic xmlns:a="http://schemas.openxmlformats.org/drawingml/2006/main">
+              <a:graphicData uri="http://schemas.openxmlformats.org/drawingml/2006/picture">
+                <pic:pic xmlns:pic="http://schemas.openxmlformats.org/drawingml/2006/picture">
+                  <pic:nvPicPr>
+                    <pic:cNvPr id="138525515" name=""/>
+                    <pic:cNvPicPr/>
+                  </pic:nvPicPr>
+                  <pic:blipFill>
+                    <a:blip r:embed="rId12"/>
+                    <a:stretch>
+                      <a:fillRect/>
+                    </a:stretch>
+                  </pic:blipFill>
+                  <pic:spPr>
+                    <a:xfrm>
+                      <a:off x="0" y="0"/>
+                      <a:ext cx="5940425" cy="4453255"/>
+                    </a:xfrm>
+                    <a:prstGeom prst="rect">
+                      <a:avLst/>
+                    </a:prstGeom>
+                  </pic:spPr>
+                </pic:pic>
+              </a:graphicData>
+            </a:graphic>
+          </wp:inline>
+        </w:drawing>
+      </w:r>
+    </w:p>
+    <w:p>
+      <w:pPr>
+        <w:ind w:left="360"/>
+        <w:rPr>
+          <w:rFonts w:ascii="Calibri" w:eastAsia="Calibri" w:hAnsi="Calibri" w:cs="Calibri"/>
+          <w:lang w:val="en-US"/>
+        </w:rPr>
+      </w:pPr>
+      <w:r>
+        <w:rPr>
+          <w:rFonts w:ascii="Calibri" w:eastAsia="Calibri" w:hAnsi="Calibri" w:cs="Calibri"/>
+          <w:lang w:val="en-US"/>
+        </w:rPr>
+        <w:t>After all steps:</w:t>
+      </w:r>
+    </w:p>
+    <w:p>
+      <w:pPr>
+        <w:ind w:left="360"/>
+        <w:rPr>
+          <w:rFonts w:ascii="Calibri" w:eastAsia="Calibri" w:hAnsi="Calibri" w:cs="Calibri"/>
+          <w:lang w:val="en-US"/>
+        </w:rPr>
+      </w:pPr>
+      <m:oMath>
+        <m:sSub>
+          <m:sSubPr>
+            <m:ctrlPr>
+              <w:rPr>
+                <w:rFonts w:ascii="Cambria Math" w:eastAsia="Calibri" w:hAnsi="Cambria Math" w:cs="Calibri"/>
+                <w:i/>
+                <w:lang w:val="en-US"/>
+              </w:rPr>
+            </m:ctrlPr>
+          </m:sSubPr>
+          <m:e>
+            <m:r>
+              <w:rPr>
+                <w:rFonts w:ascii="Cambria Math" w:eastAsia="Calibri" w:hAnsi="Cambria Math" w:cs="Calibri"/>
+                <w:lang w:val="en-US"/>
+              </w:rPr>
+              <m:t>H</m:t>
+            </m:r>
+          </m:e>
+          <m:sub>
+            <m:r>
+              <w:rPr>
+                <w:rFonts w:ascii="Cambria Math" w:eastAsia="Calibri" w:hAnsi="Cambria Math" w:cs="Calibri"/>
+                <w:lang w:val="en-US"/>
+              </w:rPr>
+              <m:t>t</m:t>
+            </m:r>
+          </m:sub>
+        </m:sSub>
+        <m:r>
+          <w:rPr>
+            <w:rFonts w:ascii="Cambria Math" w:eastAsia="Calibri" w:hAnsi="Cambria Math" w:cs="Calibri"/>
+            <w:lang w:val="en-US"/>
+          </w:rPr>
+          <m:t xml:space="preserve"> </m:t>
+        </m:r>
+        <m:sSub>
+          <m:sSubPr>
+            <m:ctrlPr>
+              <w:rPr>
+                <w:rFonts w:ascii="Cambria Math" w:eastAsia="Calibri" w:hAnsi="Cambria Math" w:cs="Calibri"/>
+                <w:i/>
+                <w:lang w:val="en-US"/>
+              </w:rPr>
+            </m:ctrlPr>
+          </m:sSubPr>
+          <m:e>
+            <m:r>
+              <w:rPr>
+                <w:rFonts w:ascii="Cambria Math" w:eastAsia="Calibri" w:hAnsi="Cambria Math" w:cs="Calibri"/>
+                <w:lang w:val="en-US"/>
+              </w:rPr>
+              <m:t>H</m:t>
+            </m:r>
+          </m:e>
+          <m:sub>
+            <m:r>
+              <w:rPr>
+                <w:rFonts w:ascii="Cambria Math" w:eastAsia="Calibri" w:hAnsi="Cambria Math" w:cs="Calibri"/>
+                <w:lang w:val="en-US"/>
+              </w:rPr>
+              <m:t>t-1</m:t>
+            </m:r>
+          </m:sub>
+        </m:sSub>
+        <m:r>
+          <w:rPr>
+            <w:rFonts w:ascii="Cambria Math" w:eastAsia="Calibri" w:hAnsi="Cambria Math" w:cs="Calibri"/>
+            <w:lang w:val="en-US"/>
+          </w:rPr>
+          <m:t>…</m:t>
+        </m:r>
+        <m:sSub>
+          <m:sSubPr>
+            <m:ctrlPr>
+              <w:rPr>
+                <w:rFonts w:ascii="Cambria Math" w:eastAsia="Calibri" w:hAnsi="Cambria Math" w:cs="Calibri"/>
+                <w:i/>
+                <w:lang w:val="en-US"/>
+              </w:rPr>
+            </m:ctrlPr>
+          </m:sSubPr>
+          <m:e>
+            <m:r>
+              <w:rPr>
+                <w:rFonts w:ascii="Cambria Math" w:eastAsia="Calibri" w:hAnsi="Cambria Math" w:cs="Calibri"/>
+                <w:lang w:val="en-US"/>
+              </w:rPr>
+              <m:t>H</m:t>
+            </m:r>
+          </m:e>
+          <m:sub>
+            <m:r>
+              <w:rPr>
+                <w:rFonts w:ascii="Cambria Math" w:eastAsia="Calibri" w:hAnsi="Cambria Math" w:cs="Calibri"/>
+                <w:lang w:val="en-US"/>
+              </w:rPr>
+              <m:t>1</m:t>
+            </m:r>
+          </m:sub>
+        </m:sSub>
+        <m:r>
+          <w:rPr>
+            <w:rFonts w:ascii="Cambria Math" w:eastAsia="Calibri" w:hAnsi="Cambria Math" w:cs="Calibri"/>
+            <w:lang w:val="en-US"/>
+          </w:rPr>
+          <m:t>A</m:t>
+        </m:r>
+        <m:r>
+          <w:rPr>
+            <w:rFonts w:ascii="Cambria Math" w:eastAsia="Calibri" w:hAnsi="Cambria Math" w:cs="Calibri"/>
+            <w:lang w:val="en-US"/>
+          </w:rPr>
+          <m:t>=</m:t>
+        </m:r>
+        <m:r>
+          <w:rPr>
+            <w:rFonts w:ascii="Cambria Math" w:eastAsia="Calibri" w:hAnsi="Cambria Math" w:cs="Calibri"/>
+            <w:lang w:val="en-US"/>
+          </w:rPr>
+          <m:t>R</m:t>
+        </m:r>
+      </m:oMath>
+      <w:r>
+        <w:rPr>
+          <w:rFonts w:ascii="Calibri" w:eastAsia="Calibri" w:hAnsi="Calibri" w:cs="Calibri"/>
+          <w:lang w:val="en-US"/>
+        </w:rPr>
+        <w:t xml:space="preserve"> =&gt; </w:t>
+      </w:r>
+    </w:p>
+    <w:p>
+      <w:pPr>
+        <w:ind w:left="360"/>
+        <w:rPr>
+          <w:rFonts w:ascii="Calibri" w:eastAsia="Calibri" w:hAnsi="Calibri" w:cs="Calibri"/>
+          <w:lang w:val="en-US"/>
+        </w:rPr>
+      </w:pPr>
+      <w:r>
+        <w:rPr>
+          <w:rFonts w:ascii="Calibri" w:eastAsia="Calibri" w:hAnsi="Calibri" w:cs="Calibri"/>
+          <w:lang w:val="en-US"/>
+        </w:rPr>
+        <w:t>HR = R (R = A in the beginning)</w:t>
+      </w:r>
+    </w:p>
+    <w:p>
+      <w:pPr>
+        <w:ind w:left="360"/>
+        <w:rPr>
+          <w:rFonts w:ascii="Calibri" w:eastAsia="Calibri" w:hAnsi="Calibri" w:cs="Calibri"/>
+          <w:lang w:val="en-US"/>
+        </w:rPr>
+      </w:pPr>
+      <w:r>
+        <w:rPr>
+          <w:rFonts w:ascii="Calibri" w:eastAsia="Calibri" w:hAnsi="Calibri" w:cs="Calibri"/>
+          <w:lang w:val="en-US"/>
+        </w:rPr>
+        <w:t>A = (H_1)^T * … * (H_t)^T * R</w:t>
+      </w:r>
+      <w:r>
+        <w:rPr>
+          <w:rFonts w:ascii="Calibri" w:eastAsia="Calibri" w:hAnsi="Calibri" w:cs="Calibri"/>
+          <w:lang w:val="en-US"/>
+        </w:rPr>
+        <w:t xml:space="preserve"> =&gt; Q = H_1 * … * H_t =&gt; </w:t>
+      </w:r>
+    </w:p>
+    <w:p>
+      <w:pPr>
+        <w:ind w:left="360"/>
+        <w:rPr>
+          <w:rFonts w:ascii="Calibri" w:eastAsia="Calibri" w:hAnsi="Calibri" w:cs="Calibri"/>
+          <w:lang w:val="en-US"/>
+        </w:rPr>
+      </w:pPr>
+      <w:r>
+        <w:rPr>
+          <w:rFonts w:ascii="Calibri" w:eastAsia="Calibri" w:hAnsi="Calibri" w:cs="Calibri"/>
+          <w:lang w:val="en-US"/>
+        </w:rPr>
+        <w:lastRenderedPageBreak/>
+        <w:t xml:space="preserve">Q = I in the beginning; </w:t>
+      </w:r>
+      <w:r>
+        <w:rPr>
+          <w:rFonts w:ascii="Calibri" w:eastAsia="Calibri" w:hAnsi="Calibri" w:cs="Calibri"/>
+          <w:lang w:val="en-US"/>
+        </w:rPr>
+        <w:t>Each time we apply a reflector to R:</w:t>
+      </w:r>
+      <w:r>
+        <w:rPr>
+          <w:rFonts w:ascii="Calibri" w:eastAsia="Calibri" w:hAnsi="Calibri" w:cs="Calibri"/>
+          <w:lang w:val="en-US"/>
+        </w:rPr>
+        <w:t xml:space="preserve"> R = R = HR we must also accumulate it int</w:t>
+      </w:r>
+      <w:r>
+        <w:rPr>
+          <w:rFonts w:ascii="Calibri" w:eastAsia="Calibri" w:hAnsi="Calibri" w:cs="Calibri"/>
+          <w:lang w:val="en-US"/>
+        </w:rPr>
+        <w:t>o</w:t>
+      </w:r>
+      <w:r>
+        <w:rPr>
+          <w:rFonts w:ascii="Calibri" w:eastAsia="Calibri" w:hAnsi="Calibri" w:cs="Calibri"/>
+          <w:lang w:val="en-US"/>
+        </w:rPr>
+        <w:t xml:space="preserve"> Q: Q = QH</w:t>
+      </w:r>
+      <w:r>
+        <w:rPr>
+          <w:rFonts w:ascii="Calibri" w:eastAsia="Calibri" w:hAnsi="Calibri" w:cs="Calibri"/>
+          <w:lang w:val="en-US"/>
+        </w:rPr>
+        <w:t>.</w:t>
+      </w:r>
+      <w:r>
+        <w:rPr>
+          <w:rFonts w:ascii="Calibri" w:eastAsia="Calibri" w:hAnsi="Calibri" w:cs="Calibri"/>
+          <w:lang w:val="en-US"/>
+        </w:rPr>
+        <w:t xml:space="preserve"> And Q starts just as a first reflector H (Q = IH = H), then we accumulate the rest</w:t>
+      </w:r>
+    </w:p>
+    <w:p>
+      <w:pPr>
+        <w:ind w:left="360"/>
+        <w:rPr>
+          <w:rFonts w:ascii="Calibri" w:eastAsia="Calibri" w:hAnsi="Calibri" w:cs="Calibri"/>
+          <w:lang w:val="en-US"/>
+        </w:rPr>
+      </w:pPr>
+      <w:r>
+        <w:rPr>
+          <w:rFonts w:ascii="Calibri" w:eastAsia="Calibri" w:hAnsi="Calibri" w:cs="Calibri"/>
+          <w:lang w:val="en-US"/>
+        </w:rPr>
+        <w:t>HR reflects rows of R, QH reflects cols of Q</w:t>
+      </w:r>
+      <w:r>
+        <w:rPr>
+          <w:rFonts w:ascii="Calibri" w:eastAsia="Calibri" w:hAnsi="Calibri" w:cs="Calibri"/>
+          <w:lang w:val="en-US"/>
+        </w:rPr>
+        <w:t>.</w:t>
+      </w:r>
+    </w:p>
+    <w:p>
+      <w:pPr>
+        <w:ind w:left="360"/>
+        <w:rPr>
+          <w:rFonts w:ascii="Calibri" w:eastAsia="Calibri" w:hAnsi="Calibri" w:cs="Calibri"/>
+          <w:lang w:val="en-US"/>
+        </w:rPr>
+      </w:pPr>
+    </w:p>
+    <w:p>
+      <w:pPr>
+        <w:ind w:left="360"/>
+        <w:rPr>
+          <w:rFonts w:ascii="Calibri" w:eastAsia="Calibri" w:hAnsi="Calibri" w:cs="Calibri"/>
+          <w:lang w:val="en-US"/>
+        </w:rPr>
+      </w:pPr>
+    </w:p>
+    <w:p>
+      <w:pPr>
+        <w:rPr>
+          <w:rFonts w:ascii="Calibri" w:eastAsia="Calibri" w:hAnsi="Calibri" w:cs="Calibri"/>
+          <w:lang w:val="en-US"/>
+        </w:rPr>
+      </w:pPr>
     </w:p>
     <w:sectPr>
       <w:pgSz w:w="11906" w:h="16838"/>
@@ -1706,11 +2795,11 @@
   <w:abstractNum w:abstractNumId="2" w15:restartNumberingAfterBreak="0">
     <w:nsid w:val="280F038D"/>
     <w:multiLevelType w:val="hybridMultilevel"/>
-    <w:tmpl w:val="70D6202C"/>
-    <w:lvl w:ilvl="0" w:tplc="A47A781C">
+    <w:tmpl w:val="FCD07942"/>
+    <w:lvl w:ilvl="0" w:tplc="0419000F">
       <w:start w:val="1"/>
       <w:numFmt w:val="decimal"/>
-      <w:lvlText w:val="%1)"/>
+      <w:lvlText w:val="%1."/>
       <w:lvlJc w:val="left"/>
       <w:pPr>
         <w:ind w:left="720" w:hanging="360"/>
@@ -1793,6 +2882,184 @@
     </w:lvl>
   </w:abstractNum>
   <w:abstractNum w:abstractNumId="3" w15:restartNumberingAfterBreak="0">
+    <w:nsid w:val="39C032AF"/>
+    <w:multiLevelType w:val="hybridMultilevel"/>
+    <w:tmpl w:val="2EF0FEF4"/>
+    <w:lvl w:ilvl="0" w:tplc="04190011">
+      <w:start w:val="1"/>
+      <w:numFmt w:val="decimal"/>
+      <w:lvlText w:val="%1)"/>
+      <w:lvlJc w:val="left"/>
+      <w:pPr>
+        <w:ind w:left="720" w:hanging="360"/>
+      </w:pPr>
+    </w:lvl>
+    <w:lvl w:ilvl="1" w:tplc="04190019">
+      <w:start w:val="1"/>
+      <w:numFmt w:val="lowerLetter"/>
+      <w:lvlText w:val="%2."/>
+      <w:lvlJc w:val="left"/>
+      <w:pPr>
+        <w:ind w:left="1440" w:hanging="360"/>
+      </w:pPr>
+    </w:lvl>
+    <w:lvl w:ilvl="2" w:tplc="0419001B" w:tentative="1">
+      <w:start w:val="1"/>
+      <w:numFmt w:val="lowerRoman"/>
+      <w:lvlText w:val="%3."/>
+      <w:lvlJc w:val="right"/>
+      <w:pPr>
+        <w:ind w:left="2160" w:hanging="180"/>
+      </w:pPr>
+    </w:lvl>
+    <w:lvl w:ilvl="3" w:tplc="0419000F" w:tentative="1">
+      <w:start w:val="1"/>
+      <w:numFmt w:val="decimal"/>
+      <w:lvlText w:val="%4."/>
+      <w:lvlJc w:val="left"/>
+      <w:pPr>
+        <w:ind w:left="2880" w:hanging="360"/>
+      </w:pPr>
+    </w:lvl>
+    <w:lvl w:ilvl="4" w:tplc="04190019" w:tentative="1">
+      <w:start w:val="1"/>
+      <w:numFmt w:val="lowerLetter"/>
+      <w:lvlText w:val="%5."/>
+      <w:lvlJc w:val="left"/>
+      <w:pPr>
+        <w:ind w:left="3600" w:hanging="360"/>
+      </w:pPr>
+    </w:lvl>
+    <w:lvl w:ilvl="5" w:tplc="0419001B" w:tentative="1">
+      <w:start w:val="1"/>
+      <w:numFmt w:val="lowerRoman"/>
+      <w:lvlText w:val="%6."/>
+      <w:lvlJc w:val="right"/>
+      <w:pPr>
+        <w:ind w:left="4320" w:hanging="180"/>
+      </w:pPr>
+    </w:lvl>
+    <w:lvl w:ilvl="6" w:tplc="0419000F" w:tentative="1">
+      <w:start w:val="1"/>
+      <w:numFmt w:val="decimal"/>
+      <w:lvlText w:val="%7."/>
+      <w:lvlJc w:val="left"/>
+      <w:pPr>
+        <w:ind w:left="5040" w:hanging="360"/>
+      </w:pPr>
+    </w:lvl>
+    <w:lvl w:ilvl="7" w:tplc="04190019" w:tentative="1">
+      <w:start w:val="1"/>
+      <w:numFmt w:val="lowerLetter"/>
+      <w:lvlText w:val="%8."/>
+      <w:lvlJc w:val="left"/>
+      <w:pPr>
+        <w:ind w:left="5760" w:hanging="360"/>
+      </w:pPr>
+    </w:lvl>
+    <w:lvl w:ilvl="8" w:tplc="0419001B" w:tentative="1">
+      <w:start w:val="1"/>
+      <w:numFmt w:val="lowerRoman"/>
+      <w:lvlText w:val="%9."/>
+      <w:lvlJc w:val="right"/>
+      <w:pPr>
+        <w:ind w:left="6480" w:hanging="180"/>
+      </w:pPr>
+    </w:lvl>
+  </w:abstractNum>
+  <w:abstractNum w:abstractNumId="4" w15:restartNumberingAfterBreak="0">
+    <w:nsid w:val="422D7340"/>
+    <w:multiLevelType w:val="hybridMultilevel"/>
+    <w:tmpl w:val="EF74FDD2"/>
+    <w:lvl w:ilvl="0" w:tplc="04190001">
+      <w:start w:val="1"/>
+      <w:numFmt w:val="bullet"/>
+      <w:lvlText w:val=""/>
+      <w:lvlJc w:val="left"/>
+      <w:pPr>
+        <w:ind w:left="720" w:hanging="360"/>
+      </w:pPr>
+      <w:rPr>
+        <w:rFonts w:ascii="Symbol" w:hAnsi="Symbol" w:hint="default"/>
+      </w:rPr>
+    </w:lvl>
+    <w:lvl w:ilvl="1" w:tplc="04190001">
+      <w:start w:val="1"/>
+      <w:numFmt w:val="bullet"/>
+      <w:lvlText w:val=""/>
+      <w:lvlJc w:val="left"/>
+      <w:pPr>
+        <w:ind w:left="1440" w:hanging="360"/>
+      </w:pPr>
+      <w:rPr>
+        <w:rFonts w:ascii="Symbol" w:hAnsi="Symbol" w:hint="default"/>
+      </w:rPr>
+    </w:lvl>
+    <w:lvl w:ilvl="2" w:tplc="0419001B" w:tentative="1">
+      <w:start w:val="1"/>
+      <w:numFmt w:val="lowerRoman"/>
+      <w:lvlText w:val="%3."/>
+      <w:lvlJc w:val="right"/>
+      <w:pPr>
+        <w:ind w:left="2160" w:hanging="180"/>
+      </w:pPr>
+    </w:lvl>
+    <w:lvl w:ilvl="3" w:tplc="0419000F" w:tentative="1">
+      <w:start w:val="1"/>
+      <w:numFmt w:val="decimal"/>
+      <w:lvlText w:val="%4."/>
+      <w:lvlJc w:val="left"/>
+      <w:pPr>
+        <w:ind w:left="2880" w:hanging="360"/>
+      </w:pPr>
+    </w:lvl>
+    <w:lvl w:ilvl="4" w:tplc="04190019" w:tentative="1">
+      <w:start w:val="1"/>
+      <w:numFmt w:val="lowerLetter"/>
+      <w:lvlText w:val="%5."/>
+      <w:lvlJc w:val="left"/>
+      <w:pPr>
+        <w:ind w:left="3600" w:hanging="360"/>
+      </w:pPr>
+    </w:lvl>
+    <w:lvl w:ilvl="5" w:tplc="0419001B" w:tentative="1">
+      <w:start w:val="1"/>
+      <w:numFmt w:val="lowerRoman"/>
+      <w:lvlText w:val="%6."/>
+      <w:lvlJc w:val="right"/>
+      <w:pPr>
+        <w:ind w:left="4320" w:hanging="180"/>
+      </w:pPr>
+    </w:lvl>
+    <w:lvl w:ilvl="6" w:tplc="0419000F" w:tentative="1">
+      <w:start w:val="1"/>
+      <w:numFmt w:val="decimal"/>
+      <w:lvlText w:val="%7."/>
+      <w:lvlJc w:val="left"/>
+      <w:pPr>
+        <w:ind w:left="5040" w:hanging="360"/>
+      </w:pPr>
+    </w:lvl>
+    <w:lvl w:ilvl="7" w:tplc="04190019" w:tentative="1">
+      <w:start w:val="1"/>
+      <w:numFmt w:val="lowerLetter"/>
+      <w:lvlText w:val="%8."/>
+      <w:lvlJc w:val="left"/>
+      <w:pPr>
+        <w:ind w:left="5760" w:hanging="360"/>
+      </w:pPr>
+    </w:lvl>
+    <w:lvl w:ilvl="8" w:tplc="0419001B" w:tentative="1">
+      <w:start w:val="1"/>
+      <w:numFmt w:val="lowerRoman"/>
+      <w:lvlText w:val="%9."/>
+      <w:lvlJc w:val="right"/>
+      <w:pPr>
+        <w:ind w:left="6480" w:hanging="180"/>
+      </w:pPr>
+    </w:lvl>
+  </w:abstractNum>
+  <w:abstractNum w:abstractNumId="5" w15:restartNumberingAfterBreak="0">
     <w:nsid w:val="5D35017E"/>
     <w:multiLevelType w:val="multilevel"/>
     <w:tmpl w:val="7B90ACEA"/>
@@ -1843,7 +3110,7 @@
       <w:lvlJc w:val="left"/>
     </w:lvl>
   </w:abstractNum>
-  <w:abstractNum w:abstractNumId="4" w15:restartNumberingAfterBreak="0">
+  <w:abstractNum w:abstractNumId="6" w15:restartNumberingAfterBreak="0">
     <w:nsid w:val="74251226"/>
     <w:multiLevelType w:val="multilevel"/>
     <w:tmpl w:val="0B7E1F5E"/>
@@ -1894,7 +3161,7 @@
       <w:lvlJc w:val="left"/>
     </w:lvl>
   </w:abstractNum>
-  <w:abstractNum w:abstractNumId="5" w15:restartNumberingAfterBreak="0">
+  <w:abstractNum w:abstractNumId="7" w15:restartNumberingAfterBreak="0">
     <w:nsid w:val="7AEA30AC"/>
     <w:multiLevelType w:val="multilevel"/>
     <w:tmpl w:val="569C0E88"/>
@@ -1999,23 +3266,121 @@
       </w:rPr>
     </w:lvl>
   </w:abstractNum>
+  <w:abstractNum w:abstractNumId="8" w15:restartNumberingAfterBreak="0">
+    <w:nsid w:val="7E392150"/>
+    <w:multiLevelType w:val="hybridMultilevel"/>
+    <w:tmpl w:val="A87E5A54"/>
+    <w:lvl w:ilvl="0" w:tplc="04190011">
+      <w:start w:val="1"/>
+      <w:numFmt w:val="decimal"/>
+      <w:lvlText w:val="%1)"/>
+      <w:lvlJc w:val="left"/>
+      <w:pPr>
+        <w:ind w:left="720" w:hanging="360"/>
+      </w:pPr>
+      <w:rPr>
+        <w:rFonts w:hint="default"/>
+      </w:rPr>
+    </w:lvl>
+    <w:lvl w:ilvl="1" w:tplc="FFFFFFFF">
+      <w:start w:val="1"/>
+      <w:numFmt w:val="lowerLetter"/>
+      <w:lvlText w:val="%2."/>
+      <w:lvlJc w:val="left"/>
+      <w:pPr>
+        <w:ind w:left="1440" w:hanging="360"/>
+      </w:pPr>
+    </w:lvl>
+    <w:lvl w:ilvl="2" w:tplc="FFFFFFFF" w:tentative="1">
+      <w:start w:val="1"/>
+      <w:numFmt w:val="lowerRoman"/>
+      <w:lvlText w:val="%3."/>
+      <w:lvlJc w:val="right"/>
+      <w:pPr>
+        <w:ind w:left="2160" w:hanging="180"/>
+      </w:pPr>
+    </w:lvl>
+    <w:lvl w:ilvl="3" w:tplc="FFFFFFFF" w:tentative="1">
+      <w:start w:val="1"/>
+      <w:numFmt w:val="decimal"/>
+      <w:lvlText w:val="%4."/>
+      <w:lvlJc w:val="left"/>
+      <w:pPr>
+        <w:ind w:left="2880" w:hanging="360"/>
+      </w:pPr>
+    </w:lvl>
+    <w:lvl w:ilvl="4" w:tplc="FFFFFFFF" w:tentative="1">
+      <w:start w:val="1"/>
+      <w:numFmt w:val="lowerLetter"/>
+      <w:lvlText w:val="%5."/>
+      <w:lvlJc w:val="left"/>
+      <w:pPr>
+        <w:ind w:left="3600" w:hanging="360"/>
+      </w:pPr>
+    </w:lvl>
+    <w:lvl w:ilvl="5" w:tplc="FFFFFFFF" w:tentative="1">
+      <w:start w:val="1"/>
+      <w:numFmt w:val="lowerRoman"/>
+      <w:lvlText w:val="%6."/>
+      <w:lvlJc w:val="right"/>
+      <w:pPr>
+        <w:ind w:left="4320" w:hanging="180"/>
+      </w:pPr>
+    </w:lvl>
+    <w:lvl w:ilvl="6" w:tplc="FFFFFFFF" w:tentative="1">
+      <w:start w:val="1"/>
+      <w:numFmt w:val="decimal"/>
+      <w:lvlText w:val="%7."/>
+      <w:lvlJc w:val="left"/>
+      <w:pPr>
+        <w:ind w:left="5040" w:hanging="360"/>
+      </w:pPr>
+    </w:lvl>
+    <w:lvl w:ilvl="7" w:tplc="FFFFFFFF" w:tentative="1">
+      <w:start w:val="1"/>
+      <w:numFmt w:val="lowerLetter"/>
+      <w:lvlText w:val="%8."/>
+      <w:lvlJc w:val="left"/>
+      <w:pPr>
+        <w:ind w:left="5760" w:hanging="360"/>
+      </w:pPr>
+    </w:lvl>
+    <w:lvl w:ilvl="8" w:tplc="FFFFFFFF" w:tentative="1">
+      <w:start w:val="1"/>
+      <w:numFmt w:val="lowerRoman"/>
+      <w:lvlText w:val="%9."/>
+      <w:lvlJc w:val="right"/>
+      <w:pPr>
+        <w:ind w:left="6480" w:hanging="180"/>
+      </w:pPr>
+    </w:lvl>
+  </w:abstractNum>
   <w:num w:numId="1" w16cid:durableId="959409673">
     <w:abstractNumId w:val="0"/>
   </w:num>
   <w:num w:numId="2" w16cid:durableId="1233925770">
-    <w:abstractNumId w:val="4"/>
+    <w:abstractNumId w:val="6"/>
   </w:num>
   <w:num w:numId="3" w16cid:durableId="1659844866">
     <w:abstractNumId w:val="1"/>
   </w:num>
   <w:num w:numId="4" w16cid:durableId="2087606603">
-    <w:abstractNumId w:val="3"/>
+    <w:abstractNumId w:val="5"/>
   </w:num>
   <w:num w:numId="5" w16cid:durableId="650016078">
-    <w:abstractNumId w:val="5"/>
+    <w:abstractNumId w:val="7"/>
   </w:num>
   <w:num w:numId="6" w16cid:durableId="1807314512">
     <w:abstractNumId w:val="2"/>
+  </w:num>
+  <w:num w:numId="7" w16cid:durableId="1742560169">
+    <w:abstractNumId w:val="3"/>
+  </w:num>
+  <w:num w:numId="8" w16cid:durableId="1273125808">
+    <w:abstractNumId w:val="4"/>
+  </w:num>
+  <w:num w:numId="9" w16cid:durableId="1111822338">
+    <w:abstractNumId w:val="8"/>
   </w:num>
 </w:numbering>
 </file>
@@ -2420,6 +3785,7 @@
   <w:style w:type="paragraph" w:default="1" w:styleId="a">
     <w:name w:val="Normal"/>
     <w:qFormat/>
+    <w:rsid w:val="001034A8"/>
   </w:style>
   <w:style w:type="character" w:default="1" w:styleId="a0">
     <w:name w:val="Default Paragraph Font"/>
@@ -2487,6 +3853,16 @@
       <w:ind w:left="720"/>
       <w:contextualSpacing/>
     </w:pPr>
+  </w:style>
+  <w:style w:type="character" w:styleId="a4">
+    <w:name w:val="Placeholder Text"/>
+    <w:basedOn w:val="a0"/>
+    <w:uiPriority w:val="99"/>
+    <w:semiHidden/>
+    <w:rsid w:val="001034A8"/>
+    <w:rPr>
+      <w:color w:val="666666"/>
+    </w:rPr>
   </w:style>
 </w:styles>
 </file>

</xml_diff>